<commit_message>
docs: add the interquartile factor section to the Word draft
Both 1.5 and 3.0 catch every real error; 3.0 does it while flagging 5,386
fewer rows. The section lays out that comparison so the choice of 1.5 rests
on the wider net being safe under a classify-before-acting protocol rather
than on detection power.
</commit_message>
<xml_diff>
--- a/Informe-Daniel.docx
+++ b/Informe-Daniel.docx
@@ -4814,6 +4814,1295 @@
           <w:shd w:fill="FFF8F8" w:val="clear"/>
         </w:rPr>
         <w:t>Con la tabla del grupo 4 frente al grupo 6: ¿se sostiene la clasificación actual, se reclasifica el grupo 4 como subpoblación, o se declara como la decisión más discutible del trabajo? Las tres son defendibles; hay que elegir una y explicar por qué.</w:t>
+      </w:r>
+    </w:p>
+    <w:p>
+      <w:pPr>
+        <w:pStyle w:val="Heading1"/>
+        <w:bidi w:val="0"/>
+        <w:ind w:hanging="0"/>
+        <w:rPr/>
+      </w:pPr>
+      <w:r>
+        <w:rPr/>
+        <w:t>4. El factor del rango intercuartílico</w:t>
+      </w:r>
+    </w:p>
+    <w:p>
+      <w:pPr>
+        <w:pStyle w:val="Heading2"/>
+        <w:bidi w:val="0"/>
+        <w:rPr/>
+      </w:pPr>
+      <w:r>
+        <w:rPr/>
+        <w:t>La decisión</w:t>
+      </w:r>
+    </w:p>
+    <w:p>
+      <w:pPr>
+        <w:pStyle w:val="BodyText"/>
+        <w:bidi w:val="0"/>
+        <w:rPr/>
+      </w:pPr>
+      <w:r>
+        <w:rPr/>
+        <w:t>Se adoptó el factor 1,5, valor convencional del método. El protocolo previo declaró el rango intercuartílico como criterio de detección, pero no fijó el factor, de modo que la elección debe sostenerse por sus propios méritos.</w:t>
+      </w:r>
+    </w:p>
+    <w:p>
+      <w:pPr>
+        <w:pStyle w:val="Heading2"/>
+        <w:bidi w:val="0"/>
+        <w:rPr/>
+      </w:pPr>
+      <w:r>
+        <w:rPr/>
+        <w:t>La evidencia</w:t>
+      </w:r>
+    </w:p>
+    <w:tbl>
+      <w:tblPr>
+        <w:tblW w:w="6737" w:type="dxa"/>
+        <w:jc w:val="left"/>
+        <w:tblInd w:w="28" w:type="dxa"/>
+        <w:tblLayout w:type="fixed"/>
+        <w:tblCellMar>
+          <w:top w:w="28" w:type="dxa"/>
+          <w:left w:w="28" w:type="dxa"/>
+          <w:bottom w:w="28" w:type="dxa"/>
+          <w:right w:w="28" w:type="dxa"/>
+        </w:tblCellMar>
+      </w:tblPr>
+      <w:tblGrid>
+        <w:gridCol w:w="3407"/>
+        <w:gridCol w:w="1705"/>
+        <w:gridCol w:w="1625"/>
+      </w:tblGrid>
+      <w:tr>
+        <w:trPr/>
+        <w:tc>
+          <w:tcPr>
+            <w:tcW w:w="3407" w:type="dxa"/>
+            <w:tcBorders/>
+            <w:vAlign w:val="center"/>
+          </w:tcPr>
+          <w:p>
+            <w:pPr>
+              <w:pStyle w:val="TableHeading"/>
+              <w:bidi w:val="0"/>
+              <w:spacing w:before="0" w:after="283"/>
+              <w:jc w:val="left"/>
+              <w:rPr>
+                <w:sz w:val="4"/>
+                <w:szCs w:val="4"/>
+              </w:rPr>
+            </w:pPr>
+            <w:r>
+              <w:rPr>
+                <w:sz w:val="4"/>
+                <w:szCs w:val="4"/>
+              </w:rPr>
+            </w:r>
+          </w:p>
+        </w:tc>
+        <w:tc>
+          <w:tcPr>
+            <w:tcW w:w="1705" w:type="dxa"/>
+            <w:tcBorders/>
+            <w:vAlign w:val="center"/>
+          </w:tcPr>
+          <w:p>
+            <w:pPr>
+              <w:pStyle w:val="TableHeading"/>
+              <w:suppressLineNumbers/>
+              <w:shd w:fill="E8E8E8" w:val="clear"/>
+              <w:bidi w:val="0"/>
+              <w:spacing w:before="0" w:after="283"/>
+              <w:jc w:val="left"/>
+              <w:rPr/>
+            </w:pPr>
+            <w:r>
+              <w:rPr/>
+              <w:t>Factor 1,5</w:t>
+            </w:r>
+          </w:p>
+        </w:tc>
+        <w:tc>
+          <w:tcPr>
+            <w:tcW w:w="1625" w:type="dxa"/>
+            <w:tcBorders/>
+            <w:vAlign w:val="center"/>
+          </w:tcPr>
+          <w:p>
+            <w:pPr>
+              <w:pStyle w:val="TableHeading"/>
+              <w:suppressLineNumbers/>
+              <w:shd w:fill="E8E8E8" w:val="clear"/>
+              <w:bidi w:val="0"/>
+              <w:spacing w:before="0" w:after="283"/>
+              <w:jc w:val="left"/>
+              <w:rPr/>
+            </w:pPr>
+            <w:r>
+              <w:rPr/>
+              <w:t>Factor 3,0</w:t>
+            </w:r>
+          </w:p>
+        </w:tc>
+      </w:tr>
+      <w:tr>
+        <w:trPr/>
+        <w:tc>
+          <w:tcPr>
+            <w:tcW w:w="3407" w:type="dxa"/>
+            <w:tcBorders/>
+            <w:vAlign w:val="center"/>
+          </w:tcPr>
+          <w:p>
+            <w:pPr>
+              <w:pStyle w:val="TableContents"/>
+              <w:bidi w:val="0"/>
+              <w:spacing w:before="0" w:after="283"/>
+              <w:jc w:val="left"/>
+              <w:rPr/>
+            </w:pPr>
+            <w:r>
+              <w:rPr/>
+              <w:t>Filas marcadas como candidatas</w:t>
+            </w:r>
+          </w:p>
+        </w:tc>
+        <w:tc>
+          <w:tcPr>
+            <w:tcW w:w="1705" w:type="dxa"/>
+            <w:tcBorders/>
+            <w:vAlign w:val="center"/>
+          </w:tcPr>
+          <w:p>
+            <w:pPr>
+              <w:pStyle w:val="TableContents"/>
+              <w:bidi w:val="0"/>
+              <w:spacing w:before="0" w:after="283"/>
+              <w:jc w:val="left"/>
+              <w:rPr>
+                <w:b/>
+              </w:rPr>
+            </w:pPr>
+            <w:r>
+              <w:rPr>
+                <w:b/>
+              </w:rPr>
+              <w:t>14.745 (22,9 %)</w:t>
+            </w:r>
+          </w:p>
+        </w:tc>
+        <w:tc>
+          <w:tcPr>
+            <w:tcW w:w="1625" w:type="dxa"/>
+            <w:tcBorders/>
+            <w:vAlign w:val="center"/>
+          </w:tcPr>
+          <w:p>
+            <w:pPr>
+              <w:pStyle w:val="TableContents"/>
+              <w:bidi w:val="0"/>
+              <w:spacing w:before="0" w:after="283"/>
+              <w:jc w:val="left"/>
+              <w:rPr/>
+            </w:pPr>
+            <w:r>
+              <w:rPr/>
+              <w:t>9.359 (14,5 %)</w:t>
+            </w:r>
+          </w:p>
+        </w:tc>
+      </w:tr>
+      <w:tr>
+        <w:trPr/>
+        <w:tc>
+          <w:tcPr>
+            <w:tcW w:w="3407" w:type="dxa"/>
+            <w:tcBorders/>
+            <w:vAlign w:val="center"/>
+          </w:tcPr>
+          <w:p>
+            <w:pPr>
+              <w:pStyle w:val="TableContents"/>
+              <w:bidi w:val="0"/>
+              <w:spacing w:before="0" w:after="283"/>
+              <w:jc w:val="left"/>
+              <w:rPr/>
+            </w:pPr>
+            <w:r>
+              <w:rPr/>
+              <w:t xml:space="preserve">Detecta </w:t>
+            </w:r>
+            <w:r>
+              <w:rPr>
+                <w:i/>
+              </w:rPr>
+              <w:t>Age</w:t>
+            </w:r>
+            <w:r>
+              <w:rPr/>
+              <w:t xml:space="preserve"> = 279</w:t>
+            </w:r>
+          </w:p>
+        </w:tc>
+        <w:tc>
+          <w:tcPr>
+            <w:tcW w:w="1705" w:type="dxa"/>
+            <w:tcBorders/>
+            <w:vAlign w:val="center"/>
+          </w:tcPr>
+          <w:p>
+            <w:pPr>
+              <w:pStyle w:val="TableContents"/>
+              <w:bidi w:val="0"/>
+              <w:spacing w:before="0" w:after="283"/>
+              <w:jc w:val="left"/>
+              <w:rPr/>
+            </w:pPr>
+            <w:r>
+              <w:rPr/>
+              <w:t>1 de 1</w:t>
+            </w:r>
+          </w:p>
+        </w:tc>
+        <w:tc>
+          <w:tcPr>
+            <w:tcW w:w="1625" w:type="dxa"/>
+            <w:tcBorders/>
+            <w:vAlign w:val="center"/>
+          </w:tcPr>
+          <w:p>
+            <w:pPr>
+              <w:pStyle w:val="TableContents"/>
+              <w:bidi w:val="0"/>
+              <w:spacing w:before="0" w:after="283"/>
+              <w:jc w:val="left"/>
+              <w:rPr/>
+            </w:pPr>
+            <w:r>
+              <w:rPr/>
+              <w:t>1 de 1</w:t>
+            </w:r>
+          </w:p>
+        </w:tc>
+      </w:tr>
+      <w:tr>
+        <w:trPr/>
+        <w:tc>
+          <w:tcPr>
+            <w:tcW w:w="3407" w:type="dxa"/>
+            <w:tcBorders/>
+            <w:vAlign w:val="center"/>
+          </w:tcPr>
+          <w:p>
+            <w:pPr>
+              <w:pStyle w:val="TableContents"/>
+              <w:bidi w:val="0"/>
+              <w:spacing w:before="0" w:after="283"/>
+              <w:jc w:val="left"/>
+              <w:rPr/>
+            </w:pPr>
+            <w:r>
+              <w:rPr/>
+              <w:t xml:space="preserve">Detecta </w:t>
+            </w:r>
+            <w:r>
+              <w:rPr>
+                <w:i/>
+              </w:rPr>
+              <w:t>WorkWeekHrs</w:t>
+            </w:r>
+            <w:r>
+              <w:rPr/>
+              <w:t xml:space="preserve"> &gt; 168</w:t>
+            </w:r>
+          </w:p>
+        </w:tc>
+        <w:tc>
+          <w:tcPr>
+            <w:tcW w:w="1705" w:type="dxa"/>
+            <w:tcBorders/>
+            <w:vAlign w:val="center"/>
+          </w:tcPr>
+          <w:p>
+            <w:pPr>
+              <w:pStyle w:val="TableContents"/>
+              <w:bidi w:val="0"/>
+              <w:spacing w:before="0" w:after="283"/>
+              <w:jc w:val="left"/>
+              <w:rPr/>
+            </w:pPr>
+            <w:r>
+              <w:rPr/>
+              <w:t>62 de 62</w:t>
+            </w:r>
+          </w:p>
+        </w:tc>
+        <w:tc>
+          <w:tcPr>
+            <w:tcW w:w="1625" w:type="dxa"/>
+            <w:tcBorders/>
+            <w:vAlign w:val="center"/>
+          </w:tcPr>
+          <w:p>
+            <w:pPr>
+              <w:pStyle w:val="TableContents"/>
+              <w:bidi w:val="0"/>
+              <w:spacing w:before="0" w:after="283"/>
+              <w:jc w:val="left"/>
+              <w:rPr/>
+            </w:pPr>
+            <w:r>
+              <w:rPr/>
+              <w:t>62 de 62</w:t>
+            </w:r>
+          </w:p>
+        </w:tc>
+      </w:tr>
+      <w:tr>
+        <w:trPr/>
+        <w:tc>
+          <w:tcPr>
+            <w:tcW w:w="3407" w:type="dxa"/>
+            <w:tcBorders/>
+            <w:vAlign w:val="center"/>
+          </w:tcPr>
+          <w:p>
+            <w:pPr>
+              <w:pStyle w:val="TableContents"/>
+              <w:bidi w:val="0"/>
+              <w:spacing w:before="0" w:after="283"/>
+              <w:jc w:val="left"/>
+              <w:rPr/>
+            </w:pPr>
+            <w:r>
+              <w:rPr/>
+              <w:t xml:space="preserve">Detecta </w:t>
+            </w:r>
+            <w:r>
+              <w:rPr>
+                <w:i/>
+              </w:rPr>
+              <w:t>CompTotal</w:t>
+            </w:r>
+            <w:r>
+              <w:rPr/>
+              <w:t xml:space="preserve"> &gt; 10⁹</w:t>
+            </w:r>
+          </w:p>
+        </w:tc>
+        <w:tc>
+          <w:tcPr>
+            <w:tcW w:w="1705" w:type="dxa"/>
+            <w:tcBorders/>
+            <w:vAlign w:val="center"/>
+          </w:tcPr>
+          <w:p>
+            <w:pPr>
+              <w:pStyle w:val="TableContents"/>
+              <w:bidi w:val="0"/>
+              <w:spacing w:before="0" w:after="283"/>
+              <w:jc w:val="left"/>
+              <w:rPr/>
+            </w:pPr>
+            <w:r>
+              <w:rPr/>
+              <w:t>28 de 28</w:t>
+            </w:r>
+          </w:p>
+        </w:tc>
+        <w:tc>
+          <w:tcPr>
+            <w:tcW w:w="1625" w:type="dxa"/>
+            <w:tcBorders/>
+            <w:vAlign w:val="center"/>
+          </w:tcPr>
+          <w:p>
+            <w:pPr>
+              <w:pStyle w:val="TableContents"/>
+              <w:bidi w:val="0"/>
+              <w:spacing w:before="0" w:after="283"/>
+              <w:jc w:val="left"/>
+              <w:rPr/>
+            </w:pPr>
+            <w:r>
+              <w:rPr/>
+              <w:t>28 de 28</w:t>
+            </w:r>
+          </w:p>
+        </w:tc>
+      </w:tr>
+    </w:tbl>
+    <w:p>
+      <w:pPr>
+        <w:pStyle w:val="BodyText"/>
+        <w:bidi w:val="0"/>
+        <w:rPr/>
+      </w:pPr>
+      <w:r>
+        <w:rPr/>
+        <w:t>Límite superior por variable, con uno y otro factor:</w:t>
+      </w:r>
+    </w:p>
+    <w:tbl>
+      <w:tblPr>
+        <w:tblW w:w="6450" w:type="dxa"/>
+        <w:jc w:val="left"/>
+        <w:tblInd w:w="28" w:type="dxa"/>
+        <w:tblLayout w:type="fixed"/>
+        <w:tblCellMar>
+          <w:top w:w="28" w:type="dxa"/>
+          <w:left w:w="28" w:type="dxa"/>
+          <w:bottom w:w="28" w:type="dxa"/>
+          <w:right w:w="28" w:type="dxa"/>
+        </w:tblCellMar>
+      </w:tblPr>
+      <w:tblGrid>
+        <w:gridCol w:w="1759"/>
+        <w:gridCol w:w="1167"/>
+        <w:gridCol w:w="1156"/>
+        <w:gridCol w:w="1167"/>
+        <w:gridCol w:w="1201"/>
+      </w:tblGrid>
+      <w:tr>
+        <w:trPr/>
+        <w:tc>
+          <w:tcPr>
+            <w:tcW w:w="1759" w:type="dxa"/>
+            <w:tcBorders/>
+            <w:vAlign w:val="center"/>
+          </w:tcPr>
+          <w:p>
+            <w:pPr>
+              <w:pStyle w:val="TableHeading"/>
+              <w:suppressLineNumbers/>
+              <w:shd w:fill="E8E8E8" w:val="clear"/>
+              <w:bidi w:val="0"/>
+              <w:spacing w:before="0" w:after="283"/>
+              <w:jc w:val="left"/>
+              <w:rPr/>
+            </w:pPr>
+            <w:r>
+              <w:rPr/>
+              <w:t>Variable</w:t>
+            </w:r>
+          </w:p>
+        </w:tc>
+        <w:tc>
+          <w:tcPr>
+            <w:tcW w:w="1167" w:type="dxa"/>
+            <w:tcBorders/>
+            <w:vAlign w:val="center"/>
+          </w:tcPr>
+          <w:p>
+            <w:pPr>
+              <w:pStyle w:val="TableHeading"/>
+              <w:suppressLineNumbers/>
+              <w:shd w:fill="E8E8E8" w:val="clear"/>
+              <w:bidi w:val="0"/>
+              <w:spacing w:before="0" w:after="283"/>
+              <w:jc w:val="left"/>
+              <w:rPr/>
+            </w:pPr>
+            <w:r>
+              <w:rPr/>
+              <w:t>Factor 1,5</w:t>
+            </w:r>
+          </w:p>
+        </w:tc>
+        <w:tc>
+          <w:tcPr>
+            <w:tcW w:w="1156" w:type="dxa"/>
+            <w:tcBorders/>
+            <w:vAlign w:val="center"/>
+          </w:tcPr>
+          <w:p>
+            <w:pPr>
+              <w:pStyle w:val="TableHeading"/>
+              <w:suppressLineNumbers/>
+              <w:shd w:fill="E8E8E8" w:val="clear"/>
+              <w:bidi w:val="0"/>
+              <w:spacing w:before="0" w:after="283"/>
+              <w:jc w:val="left"/>
+              <w:rPr/>
+            </w:pPr>
+            <w:r>
+              <w:rPr/>
+              <w:t>Marcados</w:t>
+            </w:r>
+          </w:p>
+        </w:tc>
+        <w:tc>
+          <w:tcPr>
+            <w:tcW w:w="1167" w:type="dxa"/>
+            <w:tcBorders/>
+            <w:vAlign w:val="center"/>
+          </w:tcPr>
+          <w:p>
+            <w:pPr>
+              <w:pStyle w:val="TableHeading"/>
+              <w:suppressLineNumbers/>
+              <w:shd w:fill="E8E8E8" w:val="clear"/>
+              <w:bidi w:val="0"/>
+              <w:spacing w:before="0" w:after="283"/>
+              <w:jc w:val="left"/>
+              <w:rPr/>
+            </w:pPr>
+            <w:r>
+              <w:rPr/>
+              <w:t>Factor 3,0</w:t>
+            </w:r>
+          </w:p>
+        </w:tc>
+        <w:tc>
+          <w:tcPr>
+            <w:tcW w:w="1201" w:type="dxa"/>
+            <w:tcBorders/>
+            <w:vAlign w:val="center"/>
+          </w:tcPr>
+          <w:p>
+            <w:pPr>
+              <w:pStyle w:val="TableHeading"/>
+              <w:suppressLineNumbers/>
+              <w:shd w:fill="E8E8E8" w:val="clear"/>
+              <w:bidi w:val="0"/>
+              <w:spacing w:before="0" w:after="283"/>
+              <w:jc w:val="left"/>
+              <w:rPr/>
+            </w:pPr>
+            <w:r>
+              <w:rPr/>
+              <w:t>Marcados</w:t>
+            </w:r>
+          </w:p>
+        </w:tc>
+      </w:tr>
+      <w:tr>
+        <w:trPr/>
+        <w:tc>
+          <w:tcPr>
+            <w:tcW w:w="1759" w:type="dxa"/>
+            <w:tcBorders/>
+            <w:vAlign w:val="center"/>
+          </w:tcPr>
+          <w:p>
+            <w:pPr>
+              <w:pStyle w:val="TableContents"/>
+              <w:bidi w:val="0"/>
+              <w:spacing w:before="0" w:after="283"/>
+              <w:jc w:val="left"/>
+              <w:rPr/>
+            </w:pPr>
+            <w:r>
+              <w:rPr/>
+              <w:t>Age</w:t>
+            </w:r>
+          </w:p>
+        </w:tc>
+        <w:tc>
+          <w:tcPr>
+            <w:tcW w:w="1167" w:type="dxa"/>
+            <w:tcBorders/>
+            <w:vAlign w:val="center"/>
+          </w:tcPr>
+          <w:p>
+            <w:pPr>
+              <w:pStyle w:val="TableContents"/>
+              <w:bidi w:val="0"/>
+              <w:spacing w:before="0" w:after="283"/>
+              <w:jc w:val="left"/>
+              <w:rPr/>
+            </w:pPr>
+            <w:r>
+              <w:rPr/>
+              <w:t>52</w:t>
+            </w:r>
+          </w:p>
+        </w:tc>
+        <w:tc>
+          <w:tcPr>
+            <w:tcW w:w="1156" w:type="dxa"/>
+            <w:tcBorders/>
+            <w:vAlign w:val="center"/>
+          </w:tcPr>
+          <w:p>
+            <w:pPr>
+              <w:pStyle w:val="TableContents"/>
+              <w:bidi w:val="0"/>
+              <w:spacing w:before="0" w:after="283"/>
+              <w:jc w:val="left"/>
+              <w:rPr/>
+            </w:pPr>
+            <w:r>
+              <w:rPr/>
+              <w:t>1.776</w:t>
+            </w:r>
+          </w:p>
+        </w:tc>
+        <w:tc>
+          <w:tcPr>
+            <w:tcW w:w="1167" w:type="dxa"/>
+            <w:tcBorders/>
+            <w:vAlign w:val="center"/>
+          </w:tcPr>
+          <w:p>
+            <w:pPr>
+              <w:pStyle w:val="TableContents"/>
+              <w:bidi w:val="0"/>
+              <w:spacing w:before="0" w:after="283"/>
+              <w:jc w:val="left"/>
+              <w:rPr/>
+            </w:pPr>
+            <w:r>
+              <w:rPr/>
+              <w:t>68</w:t>
+            </w:r>
+          </w:p>
+        </w:tc>
+        <w:tc>
+          <w:tcPr>
+            <w:tcW w:w="1201" w:type="dxa"/>
+            <w:tcBorders/>
+            <w:vAlign w:val="center"/>
+          </w:tcPr>
+          <w:p>
+            <w:pPr>
+              <w:pStyle w:val="TableContents"/>
+              <w:bidi w:val="0"/>
+              <w:spacing w:before="0" w:after="283"/>
+              <w:jc w:val="left"/>
+              <w:rPr/>
+            </w:pPr>
+            <w:r>
+              <w:rPr/>
+              <w:t>150</w:t>
+            </w:r>
+          </w:p>
+        </w:tc>
+      </w:tr>
+      <w:tr>
+        <w:trPr/>
+        <w:tc>
+          <w:tcPr>
+            <w:tcW w:w="1759" w:type="dxa"/>
+            <w:tcBorders/>
+            <w:vAlign w:val="center"/>
+          </w:tcPr>
+          <w:p>
+            <w:pPr>
+              <w:pStyle w:val="TableContents"/>
+              <w:bidi w:val="0"/>
+              <w:spacing w:before="0" w:after="283"/>
+              <w:jc w:val="left"/>
+              <w:rPr/>
+            </w:pPr>
+            <w:r>
+              <w:rPr/>
+              <w:t>WorkWeekHrs</w:t>
+            </w:r>
+          </w:p>
+        </w:tc>
+        <w:tc>
+          <w:tcPr>
+            <w:tcW w:w="1167" w:type="dxa"/>
+            <w:tcBorders/>
+            <w:vAlign w:val="center"/>
+          </w:tcPr>
+          <w:p>
+            <w:pPr>
+              <w:pStyle w:val="TableContents"/>
+              <w:bidi w:val="0"/>
+              <w:spacing w:before="0" w:after="283"/>
+              <w:jc w:val="left"/>
+              <w:rPr/>
+            </w:pPr>
+            <w:r>
+              <w:rPr/>
+              <w:t>50</w:t>
+            </w:r>
+          </w:p>
+        </w:tc>
+        <w:tc>
+          <w:tcPr>
+            <w:tcW w:w="1156" w:type="dxa"/>
+            <w:tcBorders/>
+            <w:vAlign w:val="center"/>
+          </w:tcPr>
+          <w:p>
+            <w:pPr>
+              <w:pStyle w:val="TableContents"/>
+              <w:bidi w:val="0"/>
+              <w:spacing w:before="0" w:after="283"/>
+              <w:jc w:val="left"/>
+              <w:rPr/>
+            </w:pPr>
+            <w:r>
+              <w:rPr/>
+              <w:t>6.942</w:t>
+            </w:r>
+          </w:p>
+        </w:tc>
+        <w:tc>
+          <w:tcPr>
+            <w:tcW w:w="1167" w:type="dxa"/>
+            <w:tcBorders/>
+            <w:vAlign w:val="center"/>
+          </w:tcPr>
+          <w:p>
+            <w:pPr>
+              <w:pStyle w:val="TableContents"/>
+              <w:bidi w:val="0"/>
+              <w:spacing w:before="0" w:after="283"/>
+              <w:jc w:val="left"/>
+              <w:rPr/>
+            </w:pPr>
+            <w:r>
+              <w:rPr/>
+              <w:t>56</w:t>
+            </w:r>
+          </w:p>
+        </w:tc>
+        <w:tc>
+          <w:tcPr>
+            <w:tcW w:w="1201" w:type="dxa"/>
+            <w:tcBorders/>
+            <w:vAlign w:val="center"/>
+          </w:tcPr>
+          <w:p>
+            <w:pPr>
+              <w:pStyle w:val="TableContents"/>
+              <w:bidi w:val="0"/>
+              <w:spacing w:before="0" w:after="283"/>
+              <w:jc w:val="left"/>
+              <w:rPr/>
+            </w:pPr>
+            <w:r>
+              <w:rPr/>
+              <w:t>4.823</w:t>
+            </w:r>
+          </w:p>
+        </w:tc>
+      </w:tr>
+      <w:tr>
+        <w:trPr/>
+        <w:tc>
+          <w:tcPr>
+            <w:tcW w:w="1759" w:type="dxa"/>
+            <w:tcBorders/>
+            <w:vAlign w:val="center"/>
+          </w:tcPr>
+          <w:p>
+            <w:pPr>
+              <w:pStyle w:val="TableContents"/>
+              <w:bidi w:val="0"/>
+              <w:spacing w:before="0" w:after="283"/>
+              <w:jc w:val="left"/>
+              <w:rPr/>
+            </w:pPr>
+            <w:r>
+              <w:rPr/>
+              <w:t>ConvertedComp</w:t>
+            </w:r>
+          </w:p>
+        </w:tc>
+        <w:tc>
+          <w:tcPr>
+            <w:tcW w:w="1167" w:type="dxa"/>
+            <w:tcBorders/>
+            <w:vAlign w:val="center"/>
+          </w:tcPr>
+          <w:p>
+            <w:pPr>
+              <w:pStyle w:val="TableContents"/>
+              <w:bidi w:val="0"/>
+              <w:spacing w:before="0" w:after="283"/>
+              <w:jc w:val="left"/>
+              <w:rPr/>
+            </w:pPr>
+            <w:r>
+              <w:rPr/>
+              <w:t>200.528</w:t>
+            </w:r>
+          </w:p>
+        </w:tc>
+        <w:tc>
+          <w:tcPr>
+            <w:tcW w:w="1156" w:type="dxa"/>
+            <w:tcBorders/>
+            <w:vAlign w:val="center"/>
+          </w:tcPr>
+          <w:p>
+            <w:pPr>
+              <w:pStyle w:val="TableContents"/>
+              <w:bidi w:val="0"/>
+              <w:spacing w:before="0" w:after="283"/>
+              <w:jc w:val="left"/>
+              <w:rPr/>
+            </w:pPr>
+            <w:r>
+              <w:rPr/>
+              <w:t>2.301</w:t>
+            </w:r>
+          </w:p>
+        </w:tc>
+        <w:tc>
+          <w:tcPr>
+            <w:tcW w:w="1167" w:type="dxa"/>
+            <w:tcBorders/>
+            <w:vAlign w:val="center"/>
+          </w:tcPr>
+          <w:p>
+            <w:pPr>
+              <w:pStyle w:val="TableContents"/>
+              <w:bidi w:val="0"/>
+              <w:spacing w:before="0" w:after="283"/>
+              <w:jc w:val="left"/>
+              <w:rPr/>
+            </w:pPr>
+            <w:r>
+              <w:rPr/>
+              <w:t>306.056</w:t>
+            </w:r>
+          </w:p>
+        </w:tc>
+        <w:tc>
+          <w:tcPr>
+            <w:tcW w:w="1201" w:type="dxa"/>
+            <w:tcBorders/>
+            <w:vAlign w:val="center"/>
+          </w:tcPr>
+          <w:p>
+            <w:pPr>
+              <w:pStyle w:val="TableContents"/>
+              <w:bidi w:val="0"/>
+              <w:spacing w:before="0" w:after="283"/>
+              <w:jc w:val="left"/>
+              <w:rPr/>
+            </w:pPr>
+            <w:r>
+              <w:rPr/>
+              <w:t>1.607</w:t>
+            </w:r>
+          </w:p>
+        </w:tc>
+      </w:tr>
+      <w:tr>
+        <w:trPr/>
+        <w:tc>
+          <w:tcPr>
+            <w:tcW w:w="1759" w:type="dxa"/>
+            <w:tcBorders/>
+            <w:vAlign w:val="center"/>
+          </w:tcPr>
+          <w:p>
+            <w:pPr>
+              <w:pStyle w:val="TableContents"/>
+              <w:bidi w:val="0"/>
+              <w:spacing w:before="0" w:after="283"/>
+              <w:jc w:val="left"/>
+              <w:rPr/>
+            </w:pPr>
+            <w:r>
+              <w:rPr/>
+              <w:t>CompTotal</w:t>
+            </w:r>
+          </w:p>
+        </w:tc>
+        <w:tc>
+          <w:tcPr>
+            <w:tcW w:w="1167" w:type="dxa"/>
+            <w:tcBorders/>
+            <w:vAlign w:val="center"/>
+          </w:tcPr>
+          <w:p>
+            <w:pPr>
+              <w:pStyle w:val="TableContents"/>
+              <w:bidi w:val="0"/>
+              <w:spacing w:before="0" w:after="283"/>
+              <w:jc w:val="left"/>
+              <w:rPr/>
+            </w:pPr>
+            <w:r>
+              <w:rPr/>
+              <w:t>282.500</w:t>
+            </w:r>
+          </w:p>
+        </w:tc>
+        <w:tc>
+          <w:tcPr>
+            <w:tcW w:w="1156" w:type="dxa"/>
+            <w:tcBorders/>
+            <w:vAlign w:val="center"/>
+          </w:tcPr>
+          <w:p>
+            <w:pPr>
+              <w:pStyle w:val="TableContents"/>
+              <w:bidi w:val="0"/>
+              <w:spacing w:before="0" w:after="283"/>
+              <w:jc w:val="left"/>
+              <w:rPr/>
+            </w:pPr>
+            <w:r>
+              <w:rPr/>
+              <w:t>4.065</w:t>
+            </w:r>
+          </w:p>
+        </w:tc>
+        <w:tc>
+          <w:tcPr>
+            <w:tcW w:w="1167" w:type="dxa"/>
+            <w:tcBorders/>
+            <w:vAlign w:val="center"/>
+          </w:tcPr>
+          <w:p>
+            <w:pPr>
+              <w:pStyle w:val="TableContents"/>
+              <w:bidi w:val="0"/>
+              <w:spacing w:before="0" w:after="283"/>
+              <w:jc w:val="left"/>
+              <w:rPr/>
+            </w:pPr>
+            <w:r>
+              <w:rPr/>
+              <w:t>440.000</w:t>
+            </w:r>
+          </w:p>
+        </w:tc>
+        <w:tc>
+          <w:tcPr>
+            <w:tcW w:w="1201" w:type="dxa"/>
+            <w:tcBorders/>
+            <w:vAlign w:val="center"/>
+          </w:tcPr>
+          <w:p>
+            <w:pPr>
+              <w:pStyle w:val="TableContents"/>
+              <w:bidi w:val="0"/>
+              <w:spacing w:before="0" w:after="283"/>
+              <w:jc w:val="left"/>
+              <w:rPr/>
+            </w:pPr>
+            <w:r>
+              <w:rPr/>
+              <w:t>3.380</w:t>
+            </w:r>
+          </w:p>
+        </w:tc>
+      </w:tr>
+      <w:tr>
+        <w:trPr/>
+        <w:tc>
+          <w:tcPr>
+            <w:tcW w:w="1759" w:type="dxa"/>
+            <w:tcBorders/>
+            <w:vAlign w:val="center"/>
+          </w:tcPr>
+          <w:p>
+            <w:pPr>
+              <w:pStyle w:val="TableContents"/>
+              <w:bidi w:val="0"/>
+              <w:spacing w:before="0" w:after="283"/>
+              <w:jc w:val="left"/>
+              <w:rPr/>
+            </w:pPr>
+            <w:r>
+              <w:rPr/>
+              <w:t>YearsCode</w:t>
+            </w:r>
+          </w:p>
+        </w:tc>
+        <w:tc>
+          <w:tcPr>
+            <w:tcW w:w="1167" w:type="dxa"/>
+            <w:tcBorders/>
+            <w:vAlign w:val="center"/>
+          </w:tcPr>
+          <w:p>
+            <w:pPr>
+              <w:pStyle w:val="TableContents"/>
+              <w:bidi w:val="0"/>
+              <w:spacing w:before="0" w:after="283"/>
+              <w:jc w:val="left"/>
+              <w:rPr/>
+            </w:pPr>
+            <w:r>
+              <w:rPr/>
+              <w:t>34</w:t>
+            </w:r>
+          </w:p>
+        </w:tc>
+        <w:tc>
+          <w:tcPr>
+            <w:tcW w:w="1156" w:type="dxa"/>
+            <w:tcBorders/>
+            <w:vAlign w:val="center"/>
+          </w:tcPr>
+          <w:p>
+            <w:pPr>
+              <w:pStyle w:val="TableContents"/>
+              <w:bidi w:val="0"/>
+              <w:spacing w:before="0" w:after="283"/>
+              <w:jc w:val="left"/>
+              <w:rPr/>
+            </w:pPr>
+            <w:r>
+              <w:rPr/>
+              <w:t>3.119</w:t>
+            </w:r>
+          </w:p>
+        </w:tc>
+        <w:tc>
+          <w:tcPr>
+            <w:tcW w:w="1167" w:type="dxa"/>
+            <w:tcBorders/>
+            <w:vAlign w:val="center"/>
+          </w:tcPr>
+          <w:p>
+            <w:pPr>
+              <w:pStyle w:val="TableContents"/>
+              <w:bidi w:val="0"/>
+              <w:spacing w:before="0" w:after="283"/>
+              <w:jc w:val="left"/>
+              <w:rPr/>
+            </w:pPr>
+            <w:r>
+              <w:rPr/>
+              <w:t>50</w:t>
+            </w:r>
+          </w:p>
+        </w:tc>
+        <w:tc>
+          <w:tcPr>
+            <w:tcW w:w="1201" w:type="dxa"/>
+            <w:tcBorders/>
+            <w:vAlign w:val="center"/>
+          </w:tcPr>
+          <w:p>
+            <w:pPr>
+              <w:pStyle w:val="TableContents"/>
+              <w:bidi w:val="0"/>
+              <w:spacing w:before="0" w:after="283"/>
+              <w:jc w:val="left"/>
+              <w:rPr/>
+            </w:pPr>
+            <w:r>
+              <w:rPr/>
+              <w:t>143</w:t>
+            </w:r>
+          </w:p>
+        </w:tc>
+      </w:tr>
+      <w:tr>
+        <w:trPr/>
+        <w:tc>
+          <w:tcPr>
+            <w:tcW w:w="1759" w:type="dxa"/>
+            <w:tcBorders/>
+            <w:vAlign w:val="center"/>
+          </w:tcPr>
+          <w:p>
+            <w:pPr>
+              <w:pStyle w:val="TableContents"/>
+              <w:bidi w:val="0"/>
+              <w:spacing w:before="0" w:after="283"/>
+              <w:jc w:val="left"/>
+              <w:rPr/>
+            </w:pPr>
+            <w:r>
+              <w:rPr/>
+              <w:t>YearsCodePro</w:t>
+            </w:r>
+          </w:p>
+        </w:tc>
+        <w:tc>
+          <w:tcPr>
+            <w:tcW w:w="1167" w:type="dxa"/>
+            <w:tcBorders/>
+            <w:vAlign w:val="center"/>
+          </w:tcPr>
+          <w:p>
+            <w:pPr>
+              <w:pStyle w:val="TableContents"/>
+              <w:bidi w:val="0"/>
+              <w:spacing w:before="0" w:after="283"/>
+              <w:jc w:val="left"/>
+              <w:rPr/>
+            </w:pPr>
+            <w:r>
+              <w:rPr/>
+              <w:t>26</w:t>
+            </w:r>
+          </w:p>
+        </w:tc>
+        <w:tc>
+          <w:tcPr>
+            <w:tcW w:w="1156" w:type="dxa"/>
+            <w:tcBorders/>
+            <w:vAlign w:val="center"/>
+          </w:tcPr>
+          <w:p>
+            <w:pPr>
+              <w:pStyle w:val="TableContents"/>
+              <w:bidi w:val="0"/>
+              <w:spacing w:before="0" w:after="283"/>
+              <w:jc w:val="left"/>
+              <w:rPr/>
+            </w:pPr>
+            <w:r>
+              <w:rPr/>
+              <w:t>1.894</w:t>
+            </w:r>
+          </w:p>
+        </w:tc>
+        <w:tc>
+          <w:tcPr>
+            <w:tcW w:w="1167" w:type="dxa"/>
+            <w:tcBorders/>
+            <w:vAlign w:val="center"/>
+          </w:tcPr>
+          <w:p>
+            <w:pPr>
+              <w:pStyle w:val="TableContents"/>
+              <w:bidi w:val="0"/>
+              <w:spacing w:before="0" w:after="283"/>
+              <w:jc w:val="left"/>
+              <w:rPr/>
+            </w:pPr>
+            <w:r>
+              <w:rPr/>
+              <w:t>39</w:t>
+            </w:r>
+          </w:p>
+        </w:tc>
+        <w:tc>
+          <w:tcPr>
+            <w:tcW w:w="1201" w:type="dxa"/>
+            <w:tcBorders/>
+            <w:vAlign w:val="center"/>
+          </w:tcPr>
+          <w:p>
+            <w:pPr>
+              <w:pStyle w:val="TableContents"/>
+              <w:bidi w:val="0"/>
+              <w:spacing w:before="0" w:after="283"/>
+              <w:jc w:val="left"/>
+              <w:rPr/>
+            </w:pPr>
+            <w:r>
+              <w:rPr/>
+              <w:t>262</w:t>
+            </w:r>
+          </w:p>
+        </w:tc>
+      </w:tr>
+    </w:tbl>
+    <w:p>
+      <w:pPr>
+        <w:pStyle w:val="BodyText"/>
+        <w:bidi w:val="0"/>
+        <w:rPr/>
+      </w:pPr>
+      <w:r>
+        <w:rPr>
+          <w:b/>
+        </w:rPr>
+        <w:t>Ambos factores detectan la totalidad de los errores reales.</w:t>
+      </w:r>
+      <w:r>
+        <w:rPr/>
+        <w:t xml:space="preserve"> El factor 3,0 lo habría hecho marcando 5.386 registros menos.</w:t>
+      </w:r>
+    </w:p>
+    <w:p>
+      <w:pPr>
+        <w:pStyle w:val="Heading4"/>
+        <w:bidi w:val="0"/>
+        <w:spacing w:before="200" w:after="200"/>
+        <w:ind w:hanging="0" w:left="200" w:right="200"/>
+        <w:rPr>
+          <w:bdr w:val="dashed" w:sz="12" w:space="10" w:color="BB0000"/>
+          <w:shd w:fill="FFF8F8" w:val="clear"/>
+        </w:rPr>
+      </w:pPr>
+      <w:r>
+        <w:rPr>
+          <w:bdr w:val="dashed" w:sz="12" w:space="10" w:color="BB0000"/>
+          <w:shd w:fill="FFF8F8" w:val="clear"/>
+        </w:rPr>
+        <w:t xml:space="preserve">⬜ </w:t>
+      </w:r>
+      <w:r>
+        <w:rPr>
+          <w:bdr w:val="dashed" w:sz="12" w:space="10" w:color="BB0000"/>
+          <w:shd w:fill="FFF8F8" w:val="clear"/>
+        </w:rPr>
+        <w:t>Falta escribir: por qué 1,5 y no 3,0</w:t>
+      </w:r>
+    </w:p>
+    <w:p>
+      <w:pPr>
+        <w:pStyle w:val="BodyText"/>
+        <w:bidi w:val="0"/>
+        <w:spacing w:before="120" w:after="120"/>
+        <w:ind w:hanging="0" w:left="120" w:right="120"/>
+        <w:rPr>
+          <w:i/>
+          <w:bdr w:val="single" w:sz="18" w:space="10" w:color="666666"/>
+          <w:shd w:fill="F0F0F0" w:val="clear"/>
+        </w:rPr>
+      </w:pPr>
+      <w:r>
+        <w:rPr>
+          <w:i/>
+          <w:bdr w:val="single" w:sz="18" w:space="10" w:color="666666"/>
+          <w:shd w:fill="F0F0F0" w:val="clear"/>
+        </w:rPr>
+        <w:t>"Los casos de frontera, donde apareció la subpoblación."</w:t>
+      </w:r>
+    </w:p>
+    <w:p>
+      <w:pPr>
+        <w:pStyle w:val="BodyText"/>
+        <w:bidi w:val="0"/>
+        <w:spacing w:before="200" w:after="200"/>
+        <w:ind w:hanging="0" w:left="200" w:right="200"/>
+        <w:rPr>
+          <w:bdr w:val="dashed" w:sz="12" w:space="10" w:color="BB0000"/>
+          <w:shd w:fill="FFF8F8" w:val="clear"/>
+        </w:rPr>
+      </w:pPr>
+      <w:r>
+        <w:rPr>
+          <w:bdr w:val="dashed" w:sz="12" w:space="10" w:color="BB0000"/>
+          <w:shd w:fill="FFF8F8" w:val="clear"/>
+        </w:rPr>
+        <w:t>Falta hilarlo: si la regla fuera eliminar todo lo marcado, el factor 1,5 costaría el 23 % del dataset. Como el protocolo obliga a clasificar antes de actuar, un candidato de más cuesta revisión y no datos. Ese margen adicional es el que puso bajo la lupa el grupo de salarios altos que terminó clasificado como subpoblación distinta.</w:t>
+      </w:r>
+    </w:p>
+    <w:p>
+      <w:pPr>
+        <w:pStyle w:val="BodyText"/>
+        <w:bidi w:val="0"/>
+        <w:spacing w:before="200" w:after="200"/>
+        <w:ind w:hanging="0" w:left="200" w:right="200"/>
+        <w:rPr>
+          <w:i/>
+          <w:bdr w:val="dashed" w:sz="12" w:space="10" w:color="BB0000"/>
+          <w:shd w:fill="FFF8F8" w:val="clear"/>
+        </w:rPr>
+      </w:pPr>
+      <w:r>
+        <w:rPr>
+          <w:i/>
+          <w:bdr w:val="dashed" w:sz="12" w:space="10" w:color="BB0000"/>
+          <w:shd w:fill="FFF8F8" w:val="clear"/>
+        </w:rPr>
+        <w:t>Nota: este apartado corresponde a Tomás en el reparto del informe; el razonamiento se resolvió en la sesión de trabajo de Daniel.</w:t>
       </w:r>
     </w:p>
     <w:sectPr>

</xml_diff>